<commit_message>
fixed non parametric t tests and cleaned skeletons and such
</commit_message>
<xml_diff>
--- a/docs/content/descriptive_stats/descriptive_stats_activity.docx
+++ b/docs/content/descriptive_stats/descriptive_stats_activity.docx
@@ -26,7 +26,7 @@
         <w:t xml:space="preserve">Bill Perry</w:t>
       </w:r>
     </w:p>
-    <w:bookmarkStart w:id="15" w:name="worksheet-describing-your-data"/>
+    <w:bookmarkStart w:id="16" w:name="worksheet-describing-your-data"/>
     <w:p>
       <w:pPr>
         <w:pStyle w:val="Heading1"/>
@@ -58,23 +58,34 @@
           <w:t xml:space="preserve">📥 Download the data (.xlsx)</w:t>
         </w:r>
       </w:hyperlink>
+      <w:r>
+        <w:t xml:space="preserve"> </w:t>
+      </w:r>
+      <w:hyperlink r:id="rId11">
+        <w:r>
+          <w:rPr>
+            <w:rStyle w:val="Hyperlink"/>
+          </w:rPr>
+          <w:t xml:space="preserve">📥 Script skeleton (.R)</w:t>
+        </w:r>
+      </w:hyperlink>
     </w:p>
     <w:p>
       <w:pPr>
         <w:pStyle w:val="Heading2"/>
       </w:pPr>
-      <w:bookmarkStart w:id="11" w:name="how-to-use-this-worksheet"/>
+      <w:bookmarkStart w:id="12" w:name="how-to-use-this-worksheet"/>
       <w:r>
         <w:t xml:space="preserve">How to use this worksheet</w:t>
       </w:r>
-      <w:bookmarkEnd w:id="11"/>
+      <w:bookmarkEnd w:id="12"/>
     </w:p>
     <w:p>
       <w:pPr>
         <w:pStyle w:val="BlockText"/>
       </w:pPr>
       <w:r>
-        <w:t xml:space="preserve">Work through each part in order, at your own pace. Type every line of code yourself into a</w:t>
+        <w:t xml:space="preserve">Work through each part in order, at your own pace. Type every line of code yourself into the</w:t>
       </w:r>
       <w:r>
         <w:t xml:space="preserve"> </w:t>
@@ -84,13 +95,13 @@
           <w:b/>
           <w:bCs/>
         </w:rPr>
-        <w:t xml:space="preserve">plain R script</w:t>
-      </w:r>
-      <w:r>
-        <w:t xml:space="preserve"> </w:t>
-      </w:r>
-      <w:r>
-        <w:t xml:space="preserve">— do not copy-paste. Blocks marked</w:t>
+        <w:t xml:space="preserve">script skeleton</w:t>
+      </w:r>
+      <w:r>
+        <w:t xml:space="preserve"> </w:t>
+      </w:r>
+      <w:r>
+        <w:t xml:space="preserve">— do not copy-paste from this worksheet. Blocks marked</w:t>
       </w:r>
       <w:r>
         <w:t xml:space="preserve"> </w:t>
@@ -185,7 +196,7 @@
         <w:t xml:space="preserve"> </w:t>
       </w:r>
       <w:r>
-        <w:t xml:space="preserve">Before you start:</w:t>
+        <w:t xml:space="preserve">Before you start: download the</w:t>
       </w:r>
       <w:r>
         <w:t xml:space="preserve"> </w:t>
@@ -195,10 +206,13 @@
           <w:b/>
           <w:bCs/>
         </w:rPr>
-        <w:t xml:space="preserve">File → New File → R Script</w:t>
-      </w:r>
-      <w:r>
-        <w:t xml:space="preserve">, and save it as</w:t>
+        <w:t xml:space="preserve">script skeleton</w:t>
+      </w:r>
+      <w:r>
+        <w:t xml:space="preserve"> </w:t>
+      </w:r>
+      <w:r>
+        <w:t xml:space="preserve">from the button above and save it as</w:t>
       </w:r>
       <w:r>
         <w:t xml:space="preserve"> </w:t>
@@ -228,7 +242,7 @@
         <w:t xml:space="preserve"> </w:t>
       </w:r>
       <w:r>
-        <w:t xml:space="preserve">folder. Then work down the worksheet, adding each block to the bottom of that one script, in order.</w:t>
+        <w:t xml:space="preserve">folder. The blocks you have typed a dozen times are filled in; everything else is blank, and that blank space is the lesson.</w:t>
       </w:r>
     </w:p>
     <w:p>
@@ -334,18 +348,18 @@
                 <wp:inline>
                   <wp:extent cx="152400" cy="152400"/>
                   <wp:effectExtent b="0" l="0" r="0" t="0"/>
-                  <wp:docPr descr="" title="" id="13" name="Picture"/>
+                  <wp:docPr descr="" title="" id="14" name="Picture"/>
                   <a:graphic>
                     <a:graphicData uri="http://schemas.openxmlformats.org/drawingml/2006/picture">
                       <pic:pic>
                         <pic:nvPicPr>
-                          <pic:cNvPr descr="/Applications/Positron.app/Contents/Resources/app/quarto/share/formats/docx/important.png" id="14" name="Picture"/>
+                          <pic:cNvPr descr="/Applications/Positron.app/Contents/Resources/app/quarto/share/formats/docx/important.png" id="15" name="Picture"/>
                           <pic:cNvPicPr>
                             <a:picLocks noChangeArrowheads="1" noChangeAspect="1"/>
                           </pic:cNvPicPr>
                         </pic:nvPicPr>
                         <pic:blipFill>
-                          <a:blip r:embed="rId12"/>
+                          <a:blip r:embed="rId13"/>
                           <a:stretch>
                             <a:fillRect/>
                           </a:stretch>
@@ -755,8 +769,8 @@
         </w:pict>
       </w:r>
     </w:p>
-    <w:bookmarkEnd w:id="15"/>
-    <w:bookmarkStart w:id="16" w:name="part-1-load-and-split-the-data"/>
+    <w:bookmarkEnd w:id="16"/>
+    <w:bookmarkStart w:id="17" w:name="part-1-load-and-split-the-data"/>
     <w:p>
       <w:pPr>
         <w:pStyle w:val="Heading1"/>
@@ -1128,8 +1142,8 @@
         </w:pict>
       </w:r>
     </w:p>
-    <w:bookmarkEnd w:id="16"/>
-    <w:bookmarkStart w:id="17" w:name="part-2-mean-and-median"/>
+    <w:bookmarkEnd w:id="17"/>
+    <w:bookmarkStart w:id="18" w:name="part-2-mean-and-median"/>
     <w:p>
       <w:pPr>
         <w:pStyle w:val="Heading1"/>
@@ -1431,8 +1445,8 @@
         </w:pict>
       </w:r>
     </w:p>
-    <w:bookmarkEnd w:id="17"/>
-    <w:bookmarkStart w:id="18" w:name="part-3-variance-and-standard-deviation"/>
+    <w:bookmarkEnd w:id="18"/>
+    <w:bookmarkStart w:id="19" w:name="part-3-variance-and-standard-deviation"/>
     <w:p>
       <w:pPr>
         <w:pStyle w:val="Heading1"/>
@@ -1728,8 +1742,8 @@
         </w:pict>
       </w:r>
     </w:p>
-    <w:bookmarkEnd w:id="18"/>
-    <w:bookmarkStart w:id="22" w:name="part-3b-quantiles-range-and-iqr"/>
+    <w:bookmarkEnd w:id="19"/>
+    <w:bookmarkStart w:id="23" w:name="part-3b-quantiles-range-and-iqr"/>
     <w:p>
       <w:pPr>
         <w:pStyle w:val="Heading1"/>
@@ -2221,18 +2235,18 @@
                 <wp:inline>
                   <wp:extent cx="152400" cy="152400"/>
                   <wp:effectExtent b="0" l="0" r="0" t="0"/>
-                  <wp:docPr descr="" title="" id="20" name="Picture"/>
+                  <wp:docPr descr="" title="" id="21" name="Picture"/>
                   <a:graphic>
                     <a:graphicData uri="http://schemas.openxmlformats.org/drawingml/2006/picture">
                       <pic:pic>
                         <pic:nvPicPr>
-                          <pic:cNvPr descr="/Applications/Positron.app/Contents/Resources/app/quarto/share/formats/docx/tip.png" id="21" name="Picture"/>
+                          <pic:cNvPr descr="/Applications/Positron.app/Contents/Resources/app/quarto/share/formats/docx/tip.png" id="22" name="Picture"/>
                           <pic:cNvPicPr>
                             <a:picLocks noChangeArrowheads="1" noChangeAspect="1"/>
                           </pic:cNvPicPr>
                         </pic:nvPicPr>
                         <pic:blipFill>
-                          <a:blip r:embed="rId19"/>
+                          <a:blip r:embed="rId20"/>
                           <a:stretch>
                             <a:fillRect/>
                           </a:stretch>
@@ -2355,8 +2369,8 @@
         </w:pict>
       </w:r>
     </w:p>
-    <w:bookmarkEnd w:id="22"/>
-    <w:bookmarkStart w:id="26" w:name="part-4-the-length-trap"/>
+    <w:bookmarkEnd w:id="23"/>
+    <w:bookmarkStart w:id="27" w:name="part-4-the-length-trap"/>
     <w:p>
       <w:pPr>
         <w:pStyle w:val="Heading1"/>
@@ -2400,7 +2414,7 @@
       <w:r>
         <w:t xml:space="preserve"> </w:t>
       </w:r>
-      <w:hyperlink r:id="rId23">
+      <w:hyperlink r:id="rId24">
         <w:r>
           <w:rPr>
             <w:rStyle w:val="Hyperlink"/>
@@ -3205,18 +3219,18 @@
                 <wp:inline>
                   <wp:extent cx="152400" cy="152400"/>
                   <wp:effectExtent b="0" l="0" r="0" t="0"/>
-                  <wp:docPr descr="" title="" id="24" name="Picture"/>
+                  <wp:docPr descr="" title="" id="25" name="Picture"/>
                   <a:graphic>
                     <a:graphicData uri="http://schemas.openxmlformats.org/drawingml/2006/picture">
                       <pic:pic>
                         <pic:nvPicPr>
-                          <pic:cNvPr descr="/Applications/Positron.app/Contents/Resources/app/quarto/share/formats/docx/tip.png" id="25" name="Picture"/>
+                          <pic:cNvPr descr="/Applications/Positron.app/Contents/Resources/app/quarto/share/formats/docx/tip.png" id="26" name="Picture"/>
                           <pic:cNvPicPr>
                             <a:picLocks noChangeArrowheads="1" noChangeAspect="1"/>
                           </pic:cNvPicPr>
                         </pic:nvPicPr>
                         <pic:blipFill>
-                          <a:blip r:embed="rId19"/>
+                          <a:blip r:embed="rId20"/>
                           <a:stretch>
                             <a:fillRect/>
                           </a:stretch>
@@ -3369,8 +3383,8 @@
         </w:pict>
       </w:r>
     </w:p>
-    <w:bookmarkEnd w:id="26"/>
-    <w:bookmarkStart w:id="27" w:name="part-5-standard-error-on-real-data"/>
+    <w:bookmarkEnd w:id="27"/>
+    <w:bookmarkStart w:id="28" w:name="part-5-standard-error-on-real-data"/>
     <w:p>
       <w:pPr>
         <w:pStyle w:val="Heading1"/>
@@ -3873,8 +3887,8 @@
         </w:pict>
       </w:r>
     </w:p>
-    <w:bookmarkEnd w:id="27"/>
-    <w:bookmarkStart w:id="29" w:name="part-6-all-stats-one-group-one-summarize"/>
+    <w:bookmarkEnd w:id="28"/>
+    <w:bookmarkStart w:id="30" w:name="part-6-all-stats-one-group-one-summarize"/>
     <w:p>
       <w:pPr>
         <w:pStyle w:val="Heading1"/>
@@ -3912,7 +3926,7 @@
       <w:r>
         <w:t xml:space="preserve"> </w:t>
       </w:r>
-      <w:hyperlink r:id="rId28">
+      <w:hyperlink r:id="rId29">
         <w:r>
           <w:rPr>
             <w:rStyle w:val="Hyperlink"/>
@@ -4472,8 +4486,8 @@
         </w:pict>
       </w:r>
     </w:p>
-    <w:bookmarkEnd w:id="29"/>
-    <w:bookmarkStart w:id="31" w:name="X315b316ec89df71592efa6e9d6564f8d7b897d8"/>
+    <w:bookmarkEnd w:id="30"/>
+    <w:bookmarkStart w:id="32" w:name="X315b316ec89df71592efa6e9d6564f8d7b897d8"/>
     <w:p>
       <w:pPr>
         <w:pStyle w:val="Heading1"/>
@@ -4517,7 +4531,7 @@
       <w:r>
         <w:t xml:space="preserve"> </w:t>
       </w:r>
-      <w:hyperlink r:id="rId30">
+      <w:hyperlink r:id="rId31">
         <w:r>
           <w:rPr>
             <w:rStyle w:val="Hyperlink"/>
@@ -4772,8 +4786,8 @@
         </w:pict>
       </w:r>
     </w:p>
-    <w:bookmarkEnd w:id="31"/>
-    <w:bookmarkStart w:id="34" w:name="Xf43c5d07d843d16643c539a860b3cf5482751cd"/>
+    <w:bookmarkEnd w:id="32"/>
+    <w:bookmarkStart w:id="35" w:name="Xf43c5d07d843d16643c539a860b3cf5482751cd"/>
     <w:p>
       <w:pPr>
         <w:pStyle w:val="Heading1"/>
@@ -4826,7 +4840,7 @@
       <w:r>
         <w:t xml:space="preserve"> </w:t>
       </w:r>
-      <w:hyperlink r:id="rId28">
+      <w:hyperlink r:id="rId29">
         <w:r>
           <w:rPr>
             <w:rStyle w:val="Hyperlink"/>
@@ -5726,18 +5740,18 @@
                 <wp:inline>
                   <wp:extent cx="152400" cy="152400"/>
                   <wp:effectExtent b="0" l="0" r="0" t="0"/>
-                  <wp:docPr descr="" title="" id="32" name="Picture"/>
+                  <wp:docPr descr="" title="" id="33" name="Picture"/>
                   <a:graphic>
                     <a:graphicData uri="http://schemas.openxmlformats.org/drawingml/2006/picture">
                       <pic:pic>
                         <pic:nvPicPr>
-                          <pic:cNvPr descr="/Applications/Positron.app/Contents/Resources/app/quarto/share/formats/docx/tip.png" id="33" name="Picture"/>
+                          <pic:cNvPr descr="/Applications/Positron.app/Contents/Resources/app/quarto/share/formats/docx/tip.png" id="34" name="Picture"/>
                           <pic:cNvPicPr>
                             <a:picLocks noChangeArrowheads="1" noChangeAspect="1"/>
                           </pic:cNvPicPr>
                         </pic:nvPicPr>
                         <pic:blipFill>
-                          <a:blip r:embed="rId19"/>
+                          <a:blip r:embed="rId20"/>
                           <a:stretch>
                             <a:fillRect/>
                           </a:stretch>
@@ -5867,8 +5881,8 @@
         </w:pict>
       </w:r>
     </w:p>
-    <w:bookmarkEnd w:id="34"/>
-    <w:bookmarkStart w:id="35" w:name="part-7c-the-n-you-report-is-a-choice"/>
+    <w:bookmarkEnd w:id="35"/>
+    <w:bookmarkStart w:id="36" w:name="part-7c-the-n-you-report-is-a-choice"/>
     <w:p>
       <w:pPr>
         <w:pStyle w:val="Heading1"/>
@@ -6594,8 +6608,8 @@
         </w:pict>
       </w:r>
     </w:p>
-    <w:bookmarkEnd w:id="35"/>
-    <w:bookmarkStart w:id="38" w:name="part-7b-see-it-boxplot-with-mean-se"/>
+    <w:bookmarkEnd w:id="36"/>
+    <w:bookmarkStart w:id="39" w:name="part-7b-see-it-boxplot-with-mean-se"/>
     <w:p>
       <w:pPr>
         <w:pStyle w:val="Heading1"/>
@@ -6630,7 +6644,7 @@
       <w:r>
         <w:t xml:space="preserve"> </w:t>
       </w:r>
-      <w:hyperlink r:id="rId30">
+      <w:hyperlink r:id="rId31">
         <w:r>
           <w:rPr>
             <w:rStyle w:val="Hyperlink"/>
@@ -7827,18 +7841,18 @@
                 <wp:inline>
                   <wp:extent cx="152400" cy="152400"/>
                   <wp:effectExtent b="0" l="0" r="0" t="0"/>
-                  <wp:docPr descr="" title="" id="36" name="Picture"/>
+                  <wp:docPr descr="" title="" id="37" name="Picture"/>
                   <a:graphic>
                     <a:graphicData uri="http://schemas.openxmlformats.org/drawingml/2006/picture">
                       <pic:pic>
                         <pic:nvPicPr>
-                          <pic:cNvPr descr="/Applications/Positron.app/Contents/Resources/app/quarto/share/formats/docx/important.png" id="37" name="Picture"/>
+                          <pic:cNvPr descr="/Applications/Positron.app/Contents/Resources/app/quarto/share/formats/docx/important.png" id="38" name="Picture"/>
                           <pic:cNvPicPr>
                             <a:picLocks noChangeArrowheads="1" noChangeAspect="1"/>
                           </pic:cNvPicPr>
                         </pic:nvPicPr>
                         <pic:blipFill>
-                          <a:blip r:embed="rId12"/>
+                          <a:blip r:embed="rId13"/>
                           <a:stretch>
                             <a:fillRect/>
                           </a:stretch>
@@ -8103,8 +8117,8 @@
         </w:pict>
       </w:r>
     </w:p>
-    <w:bookmarkEnd w:id="38"/>
-    <w:bookmarkStart w:id="40" w:name="part-8-save-your-summary-table"/>
+    <w:bookmarkEnd w:id="39"/>
+    <w:bookmarkStart w:id="41" w:name="part-8-save-your-summary-table"/>
     <w:p>
       <w:pPr>
         <w:pStyle w:val="Heading1"/>
@@ -8133,7 +8147,7 @@
       <w:r>
         <w:t xml:space="preserve"> </w:t>
       </w:r>
-      <w:hyperlink r:id="rId39">
+      <w:hyperlink r:id="rId40">
         <w:r>
           <w:rPr>
             <w:rStyle w:val="Hyperlink"/>
@@ -8240,8 +8254,8 @@
         </w:pict>
       </w:r>
     </w:p>
-    <w:bookmarkEnd w:id="40"/>
-    <w:bookmarkStart w:id="44" w:name="part-9-review-and-checkpoint"/>
+    <w:bookmarkEnd w:id="41"/>
+    <w:bookmarkStart w:id="45" w:name="part-9-review-and-checkpoint"/>
     <w:p>
       <w:pPr>
         <w:pStyle w:val="Heading1"/>
@@ -8592,18 +8606,18 @@
                 <wp:inline>
                   <wp:extent cx="152400" cy="152400"/>
                   <wp:effectExtent b="0" l="0" r="0" t="0"/>
-                  <wp:docPr descr="" title="" id="42" name="Picture"/>
+                  <wp:docPr descr="" title="" id="43" name="Picture"/>
                   <a:graphic>
                     <a:graphicData uri="http://schemas.openxmlformats.org/drawingml/2006/picture">
                       <pic:pic>
                         <pic:nvPicPr>
-                          <pic:cNvPr descr="/Applications/Positron.app/Contents/Resources/app/quarto/share/formats/docx/note.png" id="43" name="Picture"/>
+                          <pic:cNvPr descr="/Applications/Positron.app/Contents/Resources/app/quarto/share/formats/docx/note.png" id="44" name="Picture"/>
                           <pic:cNvPicPr>
                             <a:picLocks noChangeArrowheads="1" noChangeAspect="1"/>
                           </pic:cNvPicPr>
                         </pic:nvPicPr>
                         <pic:blipFill>
-                          <a:blip r:embed="rId41"/>
+                          <a:blip r:embed="rId42"/>
                           <a:stretch>
                             <a:fillRect/>
                           </a:stretch>
@@ -8737,8 +8751,8 @@
         </w:pict>
       </w:r>
     </w:p>
-    <w:bookmarkEnd w:id="44"/>
-    <w:bookmarkStart w:id="47" w:name="readings"/>
+    <w:bookmarkEnd w:id="45"/>
+    <w:bookmarkStart w:id="48" w:name="readings"/>
     <w:p>
       <w:pPr>
         <w:pStyle w:val="Heading1"/>
@@ -8971,7 +8985,7 @@
       <w:r>
         <w:t xml:space="preserve"> </w:t>
       </w:r>
-      <w:hyperlink r:id="rId45">
+      <w:hyperlink r:id="rId46">
         <w:r>
           <w:rPr>
             <w:rStyle w:val="Hyperlink"/>
@@ -9040,7 +9054,7 @@
             <w:pPr>
               <w:pStyle w:val="Compact"/>
             </w:pPr>
-            <w:hyperlink r:id="rId28">
+            <w:hyperlink r:id="rId29">
               <w:r>
                 <w:rPr>
                   <w:rStyle w:val="Hyperlink"/>
@@ -9119,7 +9133,7 @@
             <w:pPr>
               <w:pStyle w:val="Compact"/>
             </w:pPr>
-            <w:hyperlink r:id="rId30">
+            <w:hyperlink r:id="rId31">
               <w:r>
                 <w:rPr>
                   <w:rStyle w:val="Hyperlink"/>
@@ -9159,7 +9173,7 @@
             <w:pPr>
               <w:pStyle w:val="Compact"/>
             </w:pPr>
-            <w:hyperlink r:id="rId46">
+            <w:hyperlink r:id="rId47">
               <w:r>
                 <w:rPr>
                   <w:rStyle w:val="Hyperlink"/>
@@ -9223,7 +9237,7 @@
             <w:pPr>
               <w:pStyle w:val="Compact"/>
             </w:pPr>
-            <w:hyperlink r:id="rId23">
+            <w:hyperlink r:id="rId24">
               <w:r>
                 <w:rPr>
                   <w:rStyle w:val="Hyperlink"/>
@@ -9296,7 +9310,7 @@
             <w:pPr>
               <w:pStyle w:val="Compact"/>
             </w:pPr>
-            <w:hyperlink r:id="rId39">
+            <w:hyperlink r:id="rId40">
               <w:r>
                 <w:rPr>
                   <w:rStyle w:val="Hyperlink"/>
@@ -9340,199 +9354,7 @@
         </w:pict>
       </w:r>
     </w:p>
-    <w:bookmarkEnd w:id="47"/>
-    <w:bookmarkStart w:id="49" w:name="getting-unstuck"/>
-    <w:p>
-      <w:pPr>
-        <w:pStyle w:val="Heading1"/>
-      </w:pPr>
-      <w:r>
-        <w:t xml:space="preserve">Getting unstuck</w:t>
-      </w:r>
-    </w:p>
-    <w:p>
-      <w:pPr>
-        <w:pStyle w:val="FirstParagraph"/>
-      </w:pPr>
-      <w:r>
-        <w:t xml:space="preserve">When code breaks — and it will, that is normal:</w:t>
-      </w:r>
-    </w:p>
-    <w:p>
-      <w:pPr>
-        <w:pStyle w:val="Compact"/>
-        <w:numPr>
-          <w:ilvl w:val="0"/>
-          <w:numId w:val="1013"/>
-        </w:numPr>
-      </w:pPr>
-      <w:r>
-        <w:rPr>
-          <w:b/>
-          <w:bCs/>
-        </w:rPr>
-        <w:t xml:space="preserve">Read the error message out loud.</w:t>
-      </w:r>
-      <w:r>
-        <w:t xml:space="preserve"> </w:t>
-      </w:r>
-      <w:r>
-        <w:t xml:space="preserve">R usually names the line and the problem.</w:t>
-      </w:r>
-    </w:p>
-    <w:p>
-      <w:pPr>
-        <w:pStyle w:val="Compact"/>
-        <w:numPr>
-          <w:ilvl w:val="0"/>
-          <w:numId w:val="1013"/>
-        </w:numPr>
-      </w:pPr>
-      <w:r>
-        <w:rPr>
-          <w:b/>
-          <w:bCs/>
-        </w:rPr>
-        <w:t xml:space="preserve">Check the usual suspects:</w:t>
-      </w:r>
-      <w:r>
-        <w:t xml:space="preserve"> </w:t>
-      </w:r>
-      <w:r>
-        <w:t xml:space="preserve">did you run</w:t>
-      </w:r>
-      <w:r>
-        <w:t xml:space="preserve"> </w:t>
-      </w:r>
-      <w:r>
-        <w:rPr>
-          <w:rStyle w:val="VerbatimChar"/>
-        </w:rPr>
-        <w:t xml:space="preserve">library(tidyverse)</w:t>
-      </w:r>
-      <w:r>
-        <w:t xml:space="preserve">? Spelling? Did you forget</w:t>
-      </w:r>
-      <w:r>
-        <w:t xml:space="preserve"> </w:t>
-      </w:r>
-      <w:r>
-        <w:rPr>
-          <w:rStyle w:val="VerbatimChar"/>
-        </w:rPr>
-        <w:t xml:space="preserve">na.rm = TRUE</w:t>
-      </w:r>
-      <w:r>
-        <w:t xml:space="preserve">?</w:t>
-      </w:r>
-    </w:p>
-    <w:p>
-      <w:pPr>
-        <w:pStyle w:val="Compact"/>
-        <w:numPr>
-          <w:ilvl w:val="0"/>
-          <w:numId w:val="1013"/>
-        </w:numPr>
-      </w:pPr>
-      <w:r>
-        <w:rPr>
-          <w:rStyle w:val="VerbatimChar"/>
-        </w:rPr>
-        <w:t xml:space="preserve">?function_name</w:t>
-      </w:r>
-      <w:r>
-        <w:t xml:space="preserve"> </w:t>
-      </w:r>
-      <w:r>
-        <w:t xml:space="preserve">opens the built-in help page.</w:t>
-      </w:r>
-    </w:p>
-    <w:p>
-      <w:pPr>
-        <w:pStyle w:val="Compact"/>
-        <w:numPr>
-          <w:ilvl w:val="0"/>
-          <w:numId w:val="1013"/>
-        </w:numPr>
-      </w:pPr>
-      <w:r>
-        <w:rPr>
-          <w:b/>
-          <w:bCs/>
-        </w:rPr>
-        <w:t xml:space="preserve">Bring the exact error</w:t>
-      </w:r>
-      <w:r>
-        <w:t xml:space="preserve"> </w:t>
-      </w:r>
-      <w:r>
-        <w:t xml:space="preserve">(copy-paste it) to class or office hours.</w:t>
-      </w:r>
-    </w:p>
-    <w:p>
-      <w:pPr>
-        <w:pStyle w:val="BlockText"/>
-      </w:pPr>
-      <w:r>
-        <w:t xml:space="preserve">📖</w:t>
-      </w:r>
-      <w:r>
-        <w:t xml:space="preserve"> </w:t>
-      </w:r>
-      <w:r>
-        <w:rPr>
-          <w:b/>
-          <w:bCs/>
-        </w:rPr>
-        <w:t xml:space="preserve">Read more:</w:t>
-      </w:r>
-      <w:r>
-        <w:t xml:space="preserve"> </w:t>
-      </w:r>
-      <w:hyperlink r:id="rId48">
-        <w:r>
-          <w:rPr>
-            <w:rStyle w:val="Hyperlink"/>
-          </w:rPr>
-          <w:t xml:space="preserve">R4DS §8 — Workflow: getting help</w:t>
-        </w:r>
-      </w:hyperlink>
-      <w:r>
-        <w:t xml:space="preserve">.</w:t>
-      </w:r>
-    </w:p>
-    <w:p>
-      <w:pPr>
-        <w:pStyle w:val="BlockText"/>
-      </w:pPr>
-      <w:r>
-        <w:t xml:space="preserve">💡</w:t>
-      </w:r>
-      <w:r>
-        <w:t xml:space="preserve"> </w:t>
-      </w:r>
-      <w:r>
-        <w:rPr>
-          <w:b/>
-          <w:bCs/>
-        </w:rPr>
-        <w:t xml:space="preserve">Key idea:</w:t>
-      </w:r>
-      <w:r>
-        <w:t xml:space="preserve"> </w:t>
-      </w:r>
-      <w:r>
-        <w:t xml:space="preserve">Every working scientist googles error messages daily. Getting stuck is not failing — it is the job.</w:t>
-      </w:r>
-    </w:p>
-    <w:p>
-      <w:r>
-        <w:pict>
-          <v:rect style="width:0;height:1.5pt" o:hralign="center" o:hrstd="t" o:hr="t"/>
-        </w:pict>
-      </w:r>
-    </w:p>
-    <w:bookmarkEnd w:id="49"/>
+    <w:bookmarkEnd w:id="48"/>
     <w:sectPr>
       <w:pgSz w:h="15840" w:w="12240"/>
       <w:pgMar w:bottom="1440" w:footer="720" w:gutter="0" w:header="720" w:left="1440" w:right="1440" w:top="1440"/>
@@ -9973,36 +9795,6 @@
   </w:num>
   <w:num w:numId="1012">
     <w:abstractNumId w:val="991"/>
-  </w:num>
-  <w:num w:numId="1013">
-    <w:abstractNumId w:val="99411"/>
-    <w:lvlOverride w:ilvl="0">
-      <w:startOverride w:val="1"/>
-    </w:lvlOverride>
-    <w:lvlOverride w:ilvl="1">
-      <w:startOverride w:val="1"/>
-    </w:lvlOverride>
-    <w:lvlOverride w:ilvl="2">
-      <w:startOverride w:val="1"/>
-    </w:lvlOverride>
-    <w:lvlOverride w:ilvl="3">
-      <w:startOverride w:val="1"/>
-    </w:lvlOverride>
-    <w:lvlOverride w:ilvl="4">
-      <w:startOverride w:val="1"/>
-    </w:lvlOverride>
-    <w:lvlOverride w:ilvl="5">
-      <w:startOverride w:val="1"/>
-    </w:lvlOverride>
-    <w:lvlOverride w:ilvl="6">
-      <w:startOverride w:val="1"/>
-    </w:lvlOverride>
-    <w:lvlOverride w:ilvl="7">
-      <w:startOverride w:val="1"/>
-    </w:lvlOverride>
-    <w:lvlOverride w:ilvl="8">
-      <w:startOverride w:val="1"/>
-    </w:lvlOverride>
   </w:num>
 </w:numbering>
 </file>

</xml_diff>